<commit_message>
Mandinić: both affiliations (Veleknin, Faculty of Agriculture)
</commit_message>
<xml_diff>
--- a/paper_itema/ITEMA_2026_Agricultural_Drones.docx
+++ b/paper_itema/ITEMA_2026_Agricultural_Drones.docx
@@ -84,7 +84,7 @@
         </w:rPr>
         <w:t xml:space="preserve">  </w:t>
       </w:r>
-      <w:hyperlink w:history="1" r:id="rIdz99ccgirkv_ps9dwis5hp">
+      <w:hyperlink w:history="1" r:id="rIdzxzyn-1s9iuir2qpkazqs">
         <w:r>
           <w:rPr>
             <w:rFonts w:ascii="Times New Roman" w:cs="Times New Roman" w:eastAsia="Times New Roman" w:hAnsi="Times New Roman"/>
@@ -1389,7 +1389,7 @@
       <w:r>
         <w:drawing>
           <wp:inline distT="0" distB="0" distL="0" distR="0">
-            <wp:extent cx="5038725" cy="3162300"/>
+            <wp:extent cx="5038725" cy="2971800"/>
             <wp:effectExtent t="0" r="0" b="0" l="0"/>
             <wp:docPr id="3" name=""/>
             <wp:cNvGraphicFramePr>
@@ -1414,7 +1414,7 @@
                   <pic:spPr bwMode="auto">
                     <a:xfrm>
                       <a:off x="0" y="0"/>
-                      <a:ext cx="5038725" cy="3162300"/>
+                      <a:ext cx="5038725" cy="2971800"/>
                     </a:xfrm>
                     <a:prstGeom prst="rect">
                       <a:avLst/>
@@ -4301,7 +4301,7 @@
           <w:sz w:val="20"/>
           <w:szCs w:val="20"/>
         </w:rPr>
-        <w:t xml:space="preserve">University of Zagreb, Faculty of Agriculture, Svetošimunska cesta 25, 10000 Zagreb, Croatia, smandini@veleknin.hr</w:t>
+        <w:t xml:space="preserve">University of Applied Sciences "Marko Marulić" in Knin, Petra Krešimira IV 30, 22300 Knin, Croatia; University of Zagreb, Faculty of Agriculture, Svetošimunska cesta 25, 10000 Zagreb, Croatia, smandini@veleknin.hr</w:t>
       </w:r>
     </w:p>
   </w:footnote>

</xml_diff>

<commit_message>
ORCID iDs of all authors
</commit_message>
<xml_diff>
--- a/paper_itema/ITEMA_2026_Agricultural_Drones.docx
+++ b/paper_itema/ITEMA_2026_Agricultural_Drones.docx
@@ -84,7 +84,7 @@
         </w:rPr>
         <w:t xml:space="preserve">  </w:t>
       </w:r>
-      <w:hyperlink w:history="1" r:id="rIdhopvnhui_ylfn1qmgdr7b">
+      <w:hyperlink w:history="1" r:id="rId409dwhzlumlo7osca01ie">
         <w:r>
           <w:rPr>
             <w:rFonts w:ascii="Times New Roman" w:cs="Times New Roman" w:eastAsia="Times New Roman" w:hAnsi="Times New Roman"/>
@@ -124,15 +124,18 @@
         </w:rPr>
         <w:t xml:space="preserve">  </w:t>
       </w:r>
-      <w:r>
-        <w:rPr>
-          <w:rFonts w:ascii="Times New Roman" w:cs="Times New Roman" w:eastAsia="Times New Roman" w:hAnsi="Times New Roman"/>
-          <w:sz w:val="20"/>
-          <w:szCs w:val="20"/>
-          <w:highlight w:val="yellow"/>
-        </w:rPr>
-        <w:t xml:space="preserve">ORCID iD to be inserted</w:t>
-      </w:r>
+      <w:hyperlink w:history="1" r:id="rIdnynkukwhh_15bahvegq2t">
+        <w:r>
+          <w:rPr>
+            <w:rFonts w:ascii="Times New Roman" w:cs="Times New Roman" w:eastAsia="Times New Roman" w:hAnsi="Times New Roman"/>
+            <w:color w:val="0563C1"/>
+            <w:sz w:val="20"/>
+            <w:szCs w:val="20"/>
+            <w:u w:val="single"/>
+          </w:rPr>
+          <w:t xml:space="preserve">https://orcid.org/0009-0006-4135-5221</w:t>
+        </w:r>
+      </w:hyperlink>
     </w:p>
     <w:p>
       <w:pPr>
@@ -161,15 +164,18 @@
         </w:rPr>
         <w:t xml:space="preserve">  </w:t>
       </w:r>
-      <w:r>
-        <w:rPr>
-          <w:rFonts w:ascii="Times New Roman" w:cs="Times New Roman" w:eastAsia="Times New Roman" w:hAnsi="Times New Roman"/>
-          <w:sz w:val="20"/>
-          <w:szCs w:val="20"/>
-          <w:highlight w:val="yellow"/>
-        </w:rPr>
-        <w:t xml:space="preserve">ORCID iD to be inserted</w:t>
-      </w:r>
+      <w:hyperlink w:history="1" r:id="rId4mcyhsd0tkopiyb-dwgci">
+        <w:r>
+          <w:rPr>
+            <w:rFonts w:ascii="Times New Roman" w:cs="Times New Roman" w:eastAsia="Times New Roman" w:hAnsi="Times New Roman"/>
+            <w:color w:val="0563C1"/>
+            <w:sz w:val="20"/>
+            <w:szCs w:val="20"/>
+            <w:u w:val="single"/>
+          </w:rPr>
+          <w:t xml:space="preserve">https://orcid.org/0009-0009-1312-5914</w:t>
+        </w:r>
+      </w:hyperlink>
     </w:p>
     <w:p>
       <w:pPr>
@@ -1180,7 +1186,7 @@
                     </pic:cNvPicPr>
                   </pic:nvPicPr>
                   <pic:blipFill>
-                    <a:blip r:embed="rId8" cstate="none"/>
+                    <a:blip r:embed="rId10" cstate="none"/>
                     <a:srcRect/>
                     <a:stretch>
                       <a:fillRect/>
@@ -1278,234 +1284,6 @@
             <wp:extent cx="5581650" cy="2143125"/>
             <wp:effectExtent t="0" r="0" b="0" l="0"/>
             <wp:docPr id="2" name=""/>
-            <wp:cNvGraphicFramePr>
-              <a:graphicFrameLocks xmlns:a="http://schemas.openxmlformats.org/drawingml/2006/main" noChangeAspect="1"/>
-            </wp:cNvGraphicFramePr>
-            <a:graphic xmlns:a="http://schemas.openxmlformats.org/drawingml/2006/main">
-              <a:graphicData uri="http://schemas.openxmlformats.org/drawingml/2006/picture">
-                <pic:pic xmlns:pic="http://schemas.openxmlformats.org/drawingml/2006/picture">
-                  <pic:nvPicPr>
-                    <pic:cNvPr id="0" name="" descr=""/>
-                    <pic:cNvPicPr>
-                      <a:picLocks noChangeAspect="1" noChangeArrowheads="1"/>
-                    </pic:cNvPicPr>
-                  </pic:nvPicPr>
-                  <pic:blipFill>
-                    <a:blip r:embed="rId9" cstate="none"/>
-                    <a:srcRect/>
-                    <a:stretch>
-                      <a:fillRect/>
-                    </a:stretch>
-                  </pic:blipFill>
-                  <pic:spPr bwMode="auto">
-                    <a:xfrm>
-                      <a:off x="0" y="0"/>
-                      <a:ext cx="5581650" cy="2143125"/>
-                    </a:xfrm>
-                    <a:prstGeom prst="rect">
-                      <a:avLst/>
-                    </a:prstGeom>
-                  </pic:spPr>
-                </pic:pic>
-              </a:graphicData>
-            </a:graphic>
-          </wp:inline>
-        </w:drawing>
-      </w:r>
-    </w:p>
-    <w:p>
-      <w:pPr>
-        <w:keepNext/>
-        <w:spacing w:after="0"/>
-        <w:jc w:val="center"/>
-      </w:pPr>
-      <w:r>
-        <w:rPr>
-          <w:rFonts w:ascii="Times New Roman" w:cs="Times New Roman" w:eastAsia="Times New Roman" w:hAnsi="Times New Roman"/>
-          <w:b/>
-          <w:bCs/>
-          <w:sz w:val="22"/>
-          <w:szCs w:val="22"/>
-        </w:rPr>
-        <w:t xml:space="preserve">Figure 2. </w:t>
-      </w:r>
-      <w:r>
-        <w:rPr>
-          <w:rFonts w:ascii="Times New Roman" w:cs="Times New Roman" w:eastAsia="Times New Roman" w:hAnsi="Times New Roman"/>
-          <w:sz w:val="22"/>
-          <w:szCs w:val="22"/>
-        </w:rPr>
-        <w:t xml:space="preserve">Penetration of seven application sub-domains, articles per 1,000 agricultural drone articles, 2010-2025 (compound annual growth 2015-2025 in brackets)</w:t>
-      </w:r>
-    </w:p>
-    <w:p>
-      <w:pPr>
-        <w:spacing w:after="240"/>
-        <w:jc w:val="center"/>
-      </w:pPr>
-      <w:r>
-        <w:rPr>
-          <w:rFonts w:ascii="Times New Roman" w:cs="Times New Roman" w:eastAsia="Times New Roman" w:hAnsi="Times New Roman"/>
-          <w:sz w:val="20"/>
-          <w:szCs w:val="20"/>
-        </w:rPr>
-        <w:t xml:space="preserve">Source: Own calculations based on OpenAlex data</w:t>
-      </w:r>
-    </w:p>
-    <w:p>
-      <w:pPr>
-        <w:keepNext/>
-        <w:spacing w:after="240" w:before="120"/>
-      </w:pPr>
-      <w:r>
-        <w:rPr>
-          <w:rFonts w:ascii="Times New Roman" w:cs="Times New Roman" w:eastAsia="Times New Roman" w:hAnsi="Times New Roman"/>
-          <w:b/>
-          <w:bCs/>
-          <w:sz w:val="24"/>
-          <w:szCs w:val="24"/>
-        </w:rPr>
-        <w:t xml:space="preserve">4.2. Keyword Structure</w:t>
-      </w:r>
-    </w:p>
-    <w:p>
-      <w:pPr>
-        <w:spacing w:after="240" w:line="240"/>
-        <w:jc w:val="both"/>
-      </w:pPr>
-      <w:r>
-        <w:rPr>
-          <w:rFonts w:ascii="Times New Roman" w:cs="Times New Roman" w:eastAsia="Times New Roman" w:hAnsi="Times New Roman"/>
-        </w:rPr>
-        <w:t xml:space="preserve">The co-occurrence network (Figure 3) contains 1,038 links between the 60 most frequent keywords and divides into five themes. Smart farming links precision agriculture with the Internet of Things, artificial intelligence, sustainability and food security, the managerial view of the field. Spectral crop monitoring groups vegetation indices, NDVI, multispectral imagery, leaf area index and regressors such as random forest, the methodological core of yield estimation. Phenotyping and crop structure connects maize, wheat, rice and soybean with plant height, nitrogen fertilization and structure from motion. Computer vision joins convolutional neural networks and object detection with weed and disease detection. The smallest theme, spraying operations, links pesticide application and crop protection with flight altitude. Smart farming and spectral monitoring form the two poles of the map, and computer vision sits between them.</w:t>
-      </w:r>
-    </w:p>
-    <w:p>
-      <w:pPr>
-        <w:keepNext/>
-        <w:spacing w:after="60" w:before="120"/>
-        <w:jc w:val="center"/>
-      </w:pPr>
-      <w:r>
-        <w:drawing>
-          <wp:inline distT="0" distB="0" distL="0" distR="0">
-            <wp:extent cx="5038725" cy="2971800"/>
-            <wp:effectExtent t="0" r="0" b="0" l="0"/>
-            <wp:docPr id="3" name=""/>
-            <wp:cNvGraphicFramePr>
-              <a:graphicFrameLocks xmlns:a="http://schemas.openxmlformats.org/drawingml/2006/main" noChangeAspect="1"/>
-            </wp:cNvGraphicFramePr>
-            <a:graphic xmlns:a="http://schemas.openxmlformats.org/drawingml/2006/main">
-              <a:graphicData uri="http://schemas.openxmlformats.org/drawingml/2006/picture">
-                <pic:pic xmlns:pic="http://schemas.openxmlformats.org/drawingml/2006/picture">
-                  <pic:nvPicPr>
-                    <pic:cNvPr id="0" name="" descr=""/>
-                    <pic:cNvPicPr>
-                      <a:picLocks noChangeAspect="1" noChangeArrowheads="1"/>
-                    </pic:cNvPicPr>
-                  </pic:nvPicPr>
-                  <pic:blipFill>
-                    <a:blip r:embed="rId10" cstate="none"/>
-                    <a:srcRect/>
-                    <a:stretch>
-                      <a:fillRect/>
-                    </a:stretch>
-                  </pic:blipFill>
-                  <pic:spPr bwMode="auto">
-                    <a:xfrm>
-                      <a:off x="0" y="0"/>
-                      <a:ext cx="5038725" cy="2971800"/>
-                    </a:xfrm>
-                    <a:prstGeom prst="rect">
-                      <a:avLst/>
-                    </a:prstGeom>
-                  </pic:spPr>
-                </pic:pic>
-              </a:graphicData>
-            </a:graphic>
-          </wp:inline>
-        </w:drawing>
-      </w:r>
-    </w:p>
-    <w:p>
-      <w:pPr>
-        <w:keepNext/>
-        <w:spacing w:after="0"/>
-        <w:jc w:val="center"/>
-      </w:pPr>
-      <w:r>
-        <w:rPr>
-          <w:rFonts w:ascii="Times New Roman" w:cs="Times New Roman" w:eastAsia="Times New Roman" w:hAnsi="Times New Roman"/>
-          <w:b/>
-          <w:bCs/>
-          <w:sz w:val="22"/>
-          <w:szCs w:val="22"/>
-        </w:rPr>
-        <w:t xml:space="preserve">Figure 3. </w:t>
-      </w:r>
-      <w:r>
-        <w:rPr>
-          <w:rFonts w:ascii="Times New Roman" w:cs="Times New Roman" w:eastAsia="Times New Roman" w:hAnsi="Times New Roman"/>
-          <w:sz w:val="22"/>
-          <w:szCs w:val="22"/>
-        </w:rPr>
-        <w:t xml:space="preserve">Keyword co-occurrence network of agricultural drone research, 60 most frequent keywords; node size shows frequency, color shows the Louvain cluster</w:t>
-      </w:r>
-    </w:p>
-    <w:p>
-      <w:pPr>
-        <w:spacing w:after="240"/>
-        <w:jc w:val="center"/>
-      </w:pPr>
-      <w:r>
-        <w:rPr>
-          <w:rFonts w:ascii="Times New Roman" w:cs="Times New Roman" w:eastAsia="Times New Roman" w:hAnsi="Times New Roman"/>
-          <w:sz w:val="20"/>
-          <w:szCs w:val="20"/>
-        </w:rPr>
-        <w:t xml:space="preserve">Source: Own calculations based on OpenAlex data</w:t>
-      </w:r>
-    </w:p>
-    <w:p>
-      <w:pPr>
-        <w:keepNext/>
-        <w:spacing w:after="240" w:before="120"/>
-      </w:pPr>
-      <w:r>
-        <w:rPr>
-          <w:rFonts w:ascii="Times New Roman" w:cs="Times New Roman" w:eastAsia="Times New Roman" w:hAnsi="Times New Roman"/>
-          <w:b/>
-          <w:bCs/>
-          <w:sz w:val="24"/>
-          <w:szCs w:val="24"/>
-        </w:rPr>
-        <w:t xml:space="preserve">4.3. Thematic Evolution and Emerging Topics</w:t>
-      </w:r>
-    </w:p>
-    <w:p>
-      <w:pPr>
-        <w:spacing w:after="240" w:line="240"/>
-        <w:jc w:val="both"/>
-      </w:pPr>
-      <w:r>
-        <w:rPr>
-          <w:rFonts w:ascii="Times New Roman" w:cs="Times New Roman" w:eastAsia="Times New Roman" w:hAnsi="Times New Roman"/>
-        </w:rPr>
-        <w:t xml:space="preserve">Figure 4 follows the themes through five periods. Until 2014, one broad theme of crop monitoring with vegetation indices dominated, next to small agronomic clusters and image stitching. Between 2015 and 2019 the field differentiated, and vegetation indices, multispectral imagery, structure from motion and weed detection became separate themes. In 2020-2022, convolutional neural networks and object detection formed a distinct theme for the first time, and random forest models joined yield prediction. Since 2023, machine learning has merged with plant disease detection, and smart-farming keywords such as the Internet of Things have formed the largest cluster. The deep-learning theme did not grow from one predecessor; it absorbed keywords from crop monitoring, weed detection and multispectral imaging.</w:t>
-      </w:r>
-    </w:p>
-    <w:p>
-      <w:pPr>
-        <w:keepNext/>
-        <w:spacing w:after="60" w:before="120"/>
-        <w:jc w:val="center"/>
-      </w:pPr>
-      <w:r>
-        <w:drawing>
-          <wp:inline distT="0" distB="0" distL="0" distR="0">
-            <wp:extent cx="5219700" cy="3000375"/>
-            <wp:effectExtent t="0" r="0" b="0" l="0"/>
-            <wp:docPr id="4" name=""/>
             <wp:cNvGraphicFramePr>
               <a:graphicFrameLocks xmlns:a="http://schemas.openxmlformats.org/drawingml/2006/main" noChangeAspect="1"/>
             </wp:cNvGraphicFramePr>
@@ -1528,6 +1306,234 @@
                   <pic:spPr bwMode="auto">
                     <a:xfrm>
                       <a:off x="0" y="0"/>
+                      <a:ext cx="5581650" cy="2143125"/>
+                    </a:xfrm>
+                    <a:prstGeom prst="rect">
+                      <a:avLst/>
+                    </a:prstGeom>
+                  </pic:spPr>
+                </pic:pic>
+              </a:graphicData>
+            </a:graphic>
+          </wp:inline>
+        </w:drawing>
+      </w:r>
+    </w:p>
+    <w:p>
+      <w:pPr>
+        <w:keepNext/>
+        <w:spacing w:after="0"/>
+        <w:jc w:val="center"/>
+      </w:pPr>
+      <w:r>
+        <w:rPr>
+          <w:rFonts w:ascii="Times New Roman" w:cs="Times New Roman" w:eastAsia="Times New Roman" w:hAnsi="Times New Roman"/>
+          <w:b/>
+          <w:bCs/>
+          <w:sz w:val="22"/>
+          <w:szCs w:val="22"/>
+        </w:rPr>
+        <w:t xml:space="preserve">Figure 2. </w:t>
+      </w:r>
+      <w:r>
+        <w:rPr>
+          <w:rFonts w:ascii="Times New Roman" w:cs="Times New Roman" w:eastAsia="Times New Roman" w:hAnsi="Times New Roman"/>
+          <w:sz w:val="22"/>
+          <w:szCs w:val="22"/>
+        </w:rPr>
+        <w:t xml:space="preserve">Penetration of seven application sub-domains, articles per 1,000 agricultural drone articles, 2010-2025 (compound annual growth 2015-2025 in brackets)</w:t>
+      </w:r>
+    </w:p>
+    <w:p>
+      <w:pPr>
+        <w:spacing w:after="240"/>
+        <w:jc w:val="center"/>
+      </w:pPr>
+      <w:r>
+        <w:rPr>
+          <w:rFonts w:ascii="Times New Roman" w:cs="Times New Roman" w:eastAsia="Times New Roman" w:hAnsi="Times New Roman"/>
+          <w:sz w:val="20"/>
+          <w:szCs w:val="20"/>
+        </w:rPr>
+        <w:t xml:space="preserve">Source: Own calculations based on OpenAlex data</w:t>
+      </w:r>
+    </w:p>
+    <w:p>
+      <w:pPr>
+        <w:keepNext/>
+        <w:spacing w:after="240" w:before="120"/>
+      </w:pPr>
+      <w:r>
+        <w:rPr>
+          <w:rFonts w:ascii="Times New Roman" w:cs="Times New Roman" w:eastAsia="Times New Roman" w:hAnsi="Times New Roman"/>
+          <w:b/>
+          <w:bCs/>
+          <w:sz w:val="24"/>
+          <w:szCs w:val="24"/>
+        </w:rPr>
+        <w:t xml:space="preserve">4.2. Keyword Structure</w:t>
+      </w:r>
+    </w:p>
+    <w:p>
+      <w:pPr>
+        <w:spacing w:after="240" w:line="240"/>
+        <w:jc w:val="both"/>
+      </w:pPr>
+      <w:r>
+        <w:rPr>
+          <w:rFonts w:ascii="Times New Roman" w:cs="Times New Roman" w:eastAsia="Times New Roman" w:hAnsi="Times New Roman"/>
+        </w:rPr>
+        <w:t xml:space="preserve">The co-occurrence network (Figure 3) contains 1,038 links between the 60 most frequent keywords and divides into five themes. Smart farming links precision agriculture with the Internet of Things, artificial intelligence, sustainability and food security, the managerial view of the field. Spectral crop monitoring groups vegetation indices, NDVI, multispectral imagery, leaf area index and regressors such as random forest, the methodological core of yield estimation. Phenotyping and crop structure connects maize, wheat, rice and soybean with plant height, nitrogen fertilization and structure from motion. Computer vision joins convolutional neural networks and object detection with weed and disease detection. The smallest theme, spraying operations, links pesticide application and crop protection with flight altitude. Smart farming and spectral monitoring form the two poles of the map, and computer vision sits between them.</w:t>
+      </w:r>
+    </w:p>
+    <w:p>
+      <w:pPr>
+        <w:keepNext/>
+        <w:spacing w:after="60" w:before="120"/>
+        <w:jc w:val="center"/>
+      </w:pPr>
+      <w:r>
+        <w:drawing>
+          <wp:inline distT="0" distB="0" distL="0" distR="0">
+            <wp:extent cx="5038725" cy="2971800"/>
+            <wp:effectExtent t="0" r="0" b="0" l="0"/>
+            <wp:docPr id="3" name=""/>
+            <wp:cNvGraphicFramePr>
+              <a:graphicFrameLocks xmlns:a="http://schemas.openxmlformats.org/drawingml/2006/main" noChangeAspect="1"/>
+            </wp:cNvGraphicFramePr>
+            <a:graphic xmlns:a="http://schemas.openxmlformats.org/drawingml/2006/main">
+              <a:graphicData uri="http://schemas.openxmlformats.org/drawingml/2006/picture">
+                <pic:pic xmlns:pic="http://schemas.openxmlformats.org/drawingml/2006/picture">
+                  <pic:nvPicPr>
+                    <pic:cNvPr id="0" name="" descr=""/>
+                    <pic:cNvPicPr>
+                      <a:picLocks noChangeAspect="1" noChangeArrowheads="1"/>
+                    </pic:cNvPicPr>
+                  </pic:nvPicPr>
+                  <pic:blipFill>
+                    <a:blip r:embed="rId12" cstate="none"/>
+                    <a:srcRect/>
+                    <a:stretch>
+                      <a:fillRect/>
+                    </a:stretch>
+                  </pic:blipFill>
+                  <pic:spPr bwMode="auto">
+                    <a:xfrm>
+                      <a:off x="0" y="0"/>
+                      <a:ext cx="5038725" cy="2971800"/>
+                    </a:xfrm>
+                    <a:prstGeom prst="rect">
+                      <a:avLst/>
+                    </a:prstGeom>
+                  </pic:spPr>
+                </pic:pic>
+              </a:graphicData>
+            </a:graphic>
+          </wp:inline>
+        </w:drawing>
+      </w:r>
+    </w:p>
+    <w:p>
+      <w:pPr>
+        <w:keepNext/>
+        <w:spacing w:after="0"/>
+        <w:jc w:val="center"/>
+      </w:pPr>
+      <w:r>
+        <w:rPr>
+          <w:rFonts w:ascii="Times New Roman" w:cs="Times New Roman" w:eastAsia="Times New Roman" w:hAnsi="Times New Roman"/>
+          <w:b/>
+          <w:bCs/>
+          <w:sz w:val="22"/>
+          <w:szCs w:val="22"/>
+        </w:rPr>
+        <w:t xml:space="preserve">Figure 3. </w:t>
+      </w:r>
+      <w:r>
+        <w:rPr>
+          <w:rFonts w:ascii="Times New Roman" w:cs="Times New Roman" w:eastAsia="Times New Roman" w:hAnsi="Times New Roman"/>
+          <w:sz w:val="22"/>
+          <w:szCs w:val="22"/>
+        </w:rPr>
+        <w:t xml:space="preserve">Keyword co-occurrence network of agricultural drone research, 60 most frequent keywords; node size shows frequency, color shows the Louvain cluster</w:t>
+      </w:r>
+    </w:p>
+    <w:p>
+      <w:pPr>
+        <w:spacing w:after="240"/>
+        <w:jc w:val="center"/>
+      </w:pPr>
+      <w:r>
+        <w:rPr>
+          <w:rFonts w:ascii="Times New Roman" w:cs="Times New Roman" w:eastAsia="Times New Roman" w:hAnsi="Times New Roman"/>
+          <w:sz w:val="20"/>
+          <w:szCs w:val="20"/>
+        </w:rPr>
+        <w:t xml:space="preserve">Source: Own calculations based on OpenAlex data</w:t>
+      </w:r>
+    </w:p>
+    <w:p>
+      <w:pPr>
+        <w:keepNext/>
+        <w:spacing w:after="240" w:before="120"/>
+      </w:pPr>
+      <w:r>
+        <w:rPr>
+          <w:rFonts w:ascii="Times New Roman" w:cs="Times New Roman" w:eastAsia="Times New Roman" w:hAnsi="Times New Roman"/>
+          <w:b/>
+          <w:bCs/>
+          <w:sz w:val="24"/>
+          <w:szCs w:val="24"/>
+        </w:rPr>
+        <w:t xml:space="preserve">4.3. Thematic Evolution and Emerging Topics</w:t>
+      </w:r>
+    </w:p>
+    <w:p>
+      <w:pPr>
+        <w:spacing w:after="240" w:line="240"/>
+        <w:jc w:val="both"/>
+      </w:pPr>
+      <w:r>
+        <w:rPr>
+          <w:rFonts w:ascii="Times New Roman" w:cs="Times New Roman" w:eastAsia="Times New Roman" w:hAnsi="Times New Roman"/>
+        </w:rPr>
+        <w:t xml:space="preserve">Figure 4 follows the themes through five periods. Until 2014, one broad theme of crop monitoring with vegetation indices dominated, next to small agronomic clusters and image stitching. Between 2015 and 2019 the field differentiated, and vegetation indices, multispectral imagery, structure from motion and weed detection became separate themes. In 2020-2022, convolutional neural networks and object detection formed a distinct theme for the first time, and random forest models joined yield prediction. Since 2023, machine learning has merged with plant disease detection, and smart-farming keywords such as the Internet of Things have formed the largest cluster. The deep-learning theme did not grow from one predecessor; it absorbed keywords from crop monitoring, weed detection and multispectral imaging.</w:t>
+      </w:r>
+    </w:p>
+    <w:p>
+      <w:pPr>
+        <w:keepNext/>
+        <w:spacing w:after="60" w:before="120"/>
+        <w:jc w:val="center"/>
+      </w:pPr>
+      <w:r>
+        <w:drawing>
+          <wp:inline distT="0" distB="0" distL="0" distR="0">
+            <wp:extent cx="5219700" cy="3000375"/>
+            <wp:effectExtent t="0" r="0" b="0" l="0"/>
+            <wp:docPr id="4" name=""/>
+            <wp:cNvGraphicFramePr>
+              <a:graphicFrameLocks xmlns:a="http://schemas.openxmlformats.org/drawingml/2006/main" noChangeAspect="1"/>
+            </wp:cNvGraphicFramePr>
+            <a:graphic xmlns:a="http://schemas.openxmlformats.org/drawingml/2006/main">
+              <a:graphicData uri="http://schemas.openxmlformats.org/drawingml/2006/picture">
+                <pic:pic xmlns:pic="http://schemas.openxmlformats.org/drawingml/2006/picture">
+                  <pic:nvPicPr>
+                    <pic:cNvPr id="0" name="" descr=""/>
+                    <pic:cNvPicPr>
+                      <a:picLocks noChangeAspect="1" noChangeArrowheads="1"/>
+                    </pic:cNvPicPr>
+                  </pic:nvPicPr>
+                  <pic:blipFill>
+                    <a:blip r:embed="rId13" cstate="none"/>
+                    <a:srcRect/>
+                    <a:stretch>
+                      <a:fillRect/>
+                    </a:stretch>
+                  </pic:blipFill>
+                  <pic:spPr bwMode="auto">
+                    <a:xfrm>
+                      <a:off x="0" y="0"/>
                       <a:ext cx="5219700" cy="3000375"/>
                     </a:xfrm>
                     <a:prstGeom prst="rect">
@@ -1617,7 +1623,7 @@
                     </pic:cNvPicPr>
                   </pic:nvPicPr>
                   <pic:blipFill>
-                    <a:blip r:embed="rId12" cstate="none"/>
+                    <a:blip r:embed="rId14" cstate="none"/>
                     <a:srcRect/>
                     <a:stretch>
                       <a:fillRect/>

</xml_diff>

<commit_message>
Full OpenAlex keyword retrieval 2005-2026 (23,080 records), final figures 3-5, Section 4.2-4.3 text, In Press references
</commit_message>
<xml_diff>
--- a/paper_itema/ITEMA_2026_Agricultural_Drones.docx
+++ b/paper_itema/ITEMA_2026_Agricultural_Drones.docx
@@ -84,7 +84,7 @@
         </w:rPr>
         <w:t xml:space="preserve">  </w:t>
       </w:r>
-      <w:hyperlink w:history="1" r:id="rId409dwhzlumlo7osca01ie">
+      <w:hyperlink w:history="1" r:id="rId-msksfgv65zb5bym75_hb">
         <w:r>
           <w:rPr>
             <w:rFonts w:ascii="Times New Roman" w:cs="Times New Roman" w:eastAsia="Times New Roman" w:hAnsi="Times New Roman"/>
@@ -124,7 +124,7 @@
         </w:rPr>
         <w:t xml:space="preserve">  </w:t>
       </w:r>
-      <w:hyperlink w:history="1" r:id="rIdnynkukwhh_15bahvegq2t">
+      <w:hyperlink w:history="1" r:id="rIdmwz6xra39qldwrk4l-pct">
         <w:r>
           <w:rPr>
             <w:rFonts w:ascii="Times New Roman" w:cs="Times New Roman" w:eastAsia="Times New Roman" w:hAnsi="Times New Roman"/>
@@ -164,7 +164,7 @@
         </w:rPr>
         <w:t xml:space="preserve">  </w:t>
       </w:r>
-      <w:hyperlink w:history="1" r:id="rId4mcyhsd0tkopiyb-dwgci">
+      <w:hyperlink w:history="1" r:id="rIdmyblxud68blcd-agfbg90">
         <w:r>
           <w:rPr>
             <w:rFonts w:ascii="Times New Roman" w:cs="Times New Roman" w:eastAsia="Times New Roman" w:hAnsi="Times New Roman"/>
@@ -320,7 +320,7 @@
           <w:rFonts w:ascii="Times New Roman" w:cs="Times New Roman" w:eastAsia="Times New Roman" w:hAnsi="Times New Roman"/>
           <w:color w:val="ED7D31"/>
         </w:rPr>
-        <w:t xml:space="preserve">(Jelić et al., 2026a)</w:t>
+        <w:t xml:space="preserve">(Jelić et al., In Press-a)</w:t>
       </w:r>
       <w:r>
         <w:rPr>
@@ -603,7 +603,7 @@
         <w:rPr>
           <w:rFonts w:ascii="Times New Roman" w:cs="Times New Roman" w:eastAsia="Times New Roman" w:hAnsi="Times New Roman"/>
         </w:rPr>
-        <w:t xml:space="preserve">For the keyword analyses, the full records of the same query, including the OpenAlex keywords, were retrieved on 22 October 2026. The retrieval reproduced the August series (4,398 against 4,381 articles for 2025) and added 2026. Records with residual homonyms, mostly the molecular-biology acronym RPA, were excluded (474 records, 3.3 percent), leaving 13,699 records with 8.1 keywords on average. A manual check of 100 random records estimated the precision of the query at 61 percent (95 percent interval 51-70 percent), lower in the early years, so absolute counts are read as query-matched records, while growth rates and shares are robust.</w:t>
+        <w:t xml:space="preserve">For the keyword analyses, the full records of the same query, including the OpenAlex keywords, were retrieved on 22 October 2026. The retrieval reproduced the August series (4,398 against 4,381 articles for 2025) and added the first ten months of 2026. Records with residual homonyms, mostly the molecular-biology acronym RPA, were excluded (723 records, 3.1 percent), leaving 22,357 records with 8.5 keywords on average. A manual check of 100 random records estimated the precision of the query at 61 percent (95 percent interval 51-70 percent), lower in the early years, so absolute counts are read as query-matched records, while growth rates and shares are robust.</w:t>
       </w:r>
     </w:p>
     <w:p>
@@ -840,7 +840,7 @@
         <w:rPr>
           <w:rFonts w:ascii="Times New Roman" w:cs="Times New Roman" w:eastAsia="Times New Roman" w:hAnsi="Times New Roman"/>
         </w:rPr>
-        <w:t xml:space="preserve"> and the map was laid out with ForceAtlas2 </w:t>
+        <w:t xml:space="preserve">, clusters with fewer than three keywords were merged into their closest neighbor, and the map was laid out with ForceAtlas2 </w:t>
       </w:r>
       <w:r>
         <w:rPr>
@@ -1263,7 +1263,7 @@
           <w:rFonts w:ascii="Times New Roman" w:cs="Times New Roman" w:eastAsia="Times New Roman" w:hAnsi="Times New Roman"/>
           <w:color w:val="ED7D31"/>
         </w:rPr>
-        <w:t xml:space="preserve">(Jelić et al., 2026b)</w:t>
+        <w:t xml:space="preserve">(Jelić et al., In Press-b)</w:t>
       </w:r>
       <w:r>
         <w:rPr>
@@ -1383,7 +1383,7 @@
         <w:rPr>
           <w:rFonts w:ascii="Times New Roman" w:cs="Times New Roman" w:eastAsia="Times New Roman" w:hAnsi="Times New Roman"/>
         </w:rPr>
-        <w:t xml:space="preserve">The co-occurrence network (Figure 3) contains 1,038 links between the 60 most frequent keywords and divides into five themes. Smart farming links precision agriculture with the Internet of Things, artificial intelligence, sustainability and food security, the managerial view of the field. Spectral crop monitoring groups vegetation indices, NDVI, multispectral imagery, leaf area index and regressors such as random forest, the methodological core of yield estimation. Phenotyping and crop structure connects maize, wheat, rice and soybean with plant height, nitrogen fertilization and structure from motion. Computer vision joins convolutional neural networks and object detection with weed and disease detection. The smallest theme, spraying operations, links pesticide application and crop protection with flight altitude. Smart farming and spectral monitoring form the two poles of the map, and computer vision sits between them.</w:t>
+        <w:t xml:space="preserve">The co-occurrence network (Figure 3) contains 1,266 links between the 60 most frequent keywords and divides into five themes. The largest, spectral monitoring and phenotyping, groups vegetation indices, NDVI, multispectral imagery, leaf area index and random forest models with major crops (maize, wheat, rice, soybean) and with yield prediction. It is the methodological core of the field. Smart farming links crop monitoring with the Internet of Things, artificial intelligence, sustainability, food security and smallholder farmers, which is the managerial view of the field. Computer vision joins convolutional neural networks, object and small object detection, semantic segmentation and transfer learning with weed and plant disease detection and with edge computing. Spraying and flight operations links pesticide application and crop protection with flight altitude and quadrotor platforms, and it also holds precision agriculture, the hub that connects all themes. The smallest theme, imaging sensors, groups multispectral, hyperspectral and thermal imaging with LiDAR.</w:t>
       </w:r>
     </w:p>
     <w:p>
@@ -1395,7 +1395,7 @@
       <w:r>
         <w:drawing>
           <wp:inline distT="0" distB="0" distL="0" distR="0">
-            <wp:extent cx="5038725" cy="2971800"/>
+            <wp:extent cx="5038725" cy="3086100"/>
             <wp:effectExtent t="0" r="0" b="0" l="0"/>
             <wp:docPr id="3" name=""/>
             <wp:cNvGraphicFramePr>
@@ -1420,7 +1420,7 @@
                   <pic:spPr bwMode="auto">
                     <a:xfrm>
                       <a:off x="0" y="0"/>
-                      <a:ext cx="5038725" cy="2971800"/>
+                      <a:ext cx="5038725" cy="3086100"/>
                     </a:xfrm>
                     <a:prstGeom prst="rect">
                       <a:avLst/>
@@ -1497,7 +1497,7 @@
         <w:rPr>
           <w:rFonts w:ascii="Times New Roman" w:cs="Times New Roman" w:eastAsia="Times New Roman" w:hAnsi="Times New Roman"/>
         </w:rPr>
-        <w:t xml:space="preserve">Figure 4 follows the themes through five periods. Until 2014, one broad theme of crop monitoring with vegetation indices dominated, next to small agronomic clusters and image stitching. Between 2015 and 2019 the field differentiated, and vegetation indices, multispectral imagery, structure from motion and weed detection became separate themes. In 2020-2022, convolutional neural networks and object detection formed a distinct theme for the first time, and random forest models joined yield prediction. Since 2023, machine learning has merged with plant disease detection, and smart-farming keywords such as the Internet of Things have formed the largest cluster. The deep-learning theme did not grow from one predecessor; it absorbed keywords from crop monitoring, weed detection and multispectral imaging.</w:t>
+        <w:t xml:space="preserve">Figure 4 follows the themes through five periods. Until 2014, one broad theme of crop monitoring with vegetation indices dominated, next to small agronomic clusters and image stitching. Between 2015 and 2019 the field differentiated into vegetation indices, multispectral imagery, structure from motion and weed detection. In 2020-2022, convolutional neural networks and object detection formed a distinct theme for the first time. Since 2023, machine learning has merged with plant disease detection. In 2025-2026, the smart-farming cluster around the Internet of Things and crop monitoring holds almost half of all keyword occurrences, plant disease detection with convolutional neural networks has become the third largest theme, and LiDAR with hyperspectral imaging appears as a separate sensor theme.</w:t>
       </w:r>
     </w:p>
     <w:p>
@@ -1509,7 +1509,7 @@
       <w:r>
         <w:drawing>
           <wp:inline distT="0" distB="0" distL="0" distR="0">
-            <wp:extent cx="5219700" cy="3000375"/>
+            <wp:extent cx="5219700" cy="2867025"/>
             <wp:effectExtent t="0" r="0" b="0" l="0"/>
             <wp:docPr id="4" name=""/>
             <wp:cNvGraphicFramePr>
@@ -1534,7 +1534,7 @@
                   <pic:spPr bwMode="auto">
                     <a:xfrm>
                       <a:off x="0" y="0"/>
-                      <a:ext cx="5219700" cy="3000375"/>
+                      <a:ext cx="5219700" cy="2867025"/>
                     </a:xfrm>
                     <a:prstGeom prst="rect">
                       <a:avLst/>
@@ -1595,7 +1595,7 @@
         <w:rPr>
           <w:rFonts w:ascii="Times New Roman" w:cs="Times New Roman" w:eastAsia="Times New Roman" w:hAnsi="Times New Roman"/>
         </w:rPr>
-        <w:t xml:space="preserve">The heatmap of emerging keywords (Figure 5) shows the latest shift year by year. Established keywords such as precision agriculture, vegetation indices and NDVI kept stable or declining shares after 2020. The fastest risers are recent detection architectures (YOLOv5 and YOLOv8), small object detection, U-Net segmentation and XGBoost, together with edge computing and blockchain. Keywords such as technology adoption barriers and agricultural productivity show that the economic side of drone use is entering the research agenda.</w:t>
+        <w:t xml:space="preserve">The heatmap (Figure 5) shows the latest shift year by year. Vegetation indices, NDVI and crop monitoring have lost share since 2021, while the Internet of Things, food security and sustainable agriculture kept rising. The fastest risers are recent detection architectures (YOLOv8 and YOLOv11), lightweight and small object detection, XGBoost, edge computing, digital twins and explainable AI. The rise of technology adoption barriers shows that the economic side of drone use is entering the research agenda.</w:t>
       </w:r>
     </w:p>
     <w:p>
@@ -1667,7 +1667,7 @@
           <w:sz w:val="22"/>
           <w:szCs w:val="22"/>
         </w:rPr>
-        <w:t xml:space="preserve">Established and emerging (*) keywords, articles per 1,000 agricultural drone articles per year; color is scaled to the maximum of each row</w:t>
+        <w:t xml:space="preserve">Established and emerging (*) keywords, articles per 1,000 agricultural drone articles per year (2026: January-October); color is scaled to the maximum of each row</w:t>
       </w:r>
     </w:p>
     <w:p>
@@ -3412,7 +3412,7 @@
         <w:rPr>
           <w:rFonts w:ascii="Times New Roman" w:cs="Times New Roman" w:eastAsia="Times New Roman" w:hAnsi="Times New Roman"/>
         </w:rPr>
-        <w:t xml:space="preserve">Research on agricultural drones grew by 28.5 percent per year between 2005 and 2025. The field is organized around five themes: smart farming, spectral crop monitoring, phenotyping and crop structure, computer vision, and spraying operations. Its focus is moving from vegetation indices towards deep learning, object detection and disease monitoring, while economic topics such as adoption barriers are emerging. The share of drone studies in the agricultural literature approaches a plateau of about 14 per 1,000 articles, 62 percent of which has been reached, and the saturating models forecast about 24,000 articles in 2035. For managers and policy makers, the next decade of value creation lies in analytics, services and regulation-compatible sensing rather than in the aircraft itself.</w:t>
+        <w:t xml:space="preserve">Research on agricultural drones grew by 28.5 percent per year between 2005 and 2025. The field is organized around five themes: spectral monitoring and phenotyping, smart farming, computer vision, spraying and flight operations, and imaging sensors. Its focus is moving from vegetation indices towards deep learning, object detection and disease monitoring, while economic topics such as adoption barriers are emerging. The share of drone studies in the agricultural literature approaches a plateau of about 14 per 1,000 articles, 62 percent of which has been reached, and the saturating models forecast about 24,000 articles in 2035. For managers and policy makers, the next decade of value creation lies in analytics, services and regulation-compatible sensing rather than in the aircraft itself.</w:t>
       </w:r>
     </w:p>
     <w:p>
@@ -3846,25 +3846,22 @@
       <w:r>
         <w:rPr>
           <w:rFonts w:ascii="Times New Roman" w:cs="Times New Roman" w:eastAsia="Times New Roman" w:hAnsi="Times New Roman"/>
-          <w:highlight w:val="yellow"/>
-        </w:rPr>
-        <w:t xml:space="preserve">Jelić, M., Uroš, V., &amp; Mandinić, S. (2026a). Drones in agriculture: Bibliometric state of the art and growth forecasts to 2035. In </w:t>
+        </w:rPr>
+        <w:t xml:space="preserve">Jelić, M., Uroš, V., &amp; Mandinić, S. (In Press-a). Drones in agriculture: Bibliometric state of the art and growth forecasts to 2035. In </w:t>
       </w:r>
       <w:r>
         <w:rPr>
           <w:rFonts w:ascii="Times New Roman" w:cs="Times New Roman" w:eastAsia="Times New Roman" w:hAnsi="Times New Roman"/>
           <w:i/>
           <w:iCs/>
-          <w:highlight w:val="yellow"/>
-        </w:rPr>
-        <w:t xml:space="preserve">Proceedings of MIPRO 2026</w:t>
-      </w:r>
-      <w:r>
-        <w:rPr>
-          <w:rFonts w:ascii="Times New Roman" w:cs="Times New Roman" w:eastAsia="Times New Roman" w:hAnsi="Times New Roman"/>
-          <w:highlight w:val="yellow"/>
-        </w:rPr>
-        <w:t xml:space="preserve"> [TO BE COMPLETED: proceedings title, pages, publisher, DOI].</w:t>
+        </w:rPr>
+        <w:t xml:space="preserve">Proceedings of the MIPRO 2026 Convention</w:t>
+      </w:r>
+      <w:r>
+        <w:rPr>
+          <w:rFonts w:ascii="Times New Roman" w:cs="Times New Roman" w:eastAsia="Times New Roman" w:hAnsi="Times New Roman"/>
+        </w:rPr>
+        <w:t xml:space="preserve">. IEEE.</w:t>
       </w:r>
     </w:p>
     <w:p>
@@ -3876,25 +3873,22 @@
       <w:r>
         <w:rPr>
           <w:rFonts w:ascii="Times New Roman" w:cs="Times New Roman" w:eastAsia="Times New Roman" w:hAnsi="Times New Roman"/>
-          <w:highlight w:val="yellow"/>
-        </w:rPr>
-        <w:t xml:space="preserve">Jelić, M., Uroš, V., &amp; Mandinić, S. (2026b). Bibliometric penetration curves and growth forecasts to 2035 for unmanned aerial vehicles in seven agricultural sub-domains. </w:t>
+        </w:rPr>
+        <w:t xml:space="preserve">Jelić, M., Uroš, V., &amp; Mandinić, S. (In Press-b). Bibliometric penetration curves and growth forecasts to 2035 for unmanned aerial vehicles in seven agricultural sub-domains. </w:t>
       </w:r>
       <w:r>
         <w:rPr>
           <w:rFonts w:ascii="Times New Roman" w:cs="Times New Roman" w:eastAsia="Times New Roman" w:hAnsi="Times New Roman"/>
           <w:i/>
           <w:iCs/>
-          <w:highlight w:val="yellow"/>
-        </w:rPr>
-        <w:t xml:space="preserve">Radovi Poljoprivredno-prehrambenog fakulteta Univerziteta u Sarajevu</w:t>
-      </w:r>
-      <w:r>
-        <w:rPr>
-          <w:rFonts w:ascii="Times New Roman" w:cs="Times New Roman" w:eastAsia="Times New Roman" w:hAnsi="Times New Roman"/>
-          <w:highlight w:val="yellow"/>
-        </w:rPr>
-        <w:t xml:space="preserve"> [TO BE COMPLETED: volume, issue, pages, DOI].</w:t>
+        </w:rPr>
+        <w:t xml:space="preserve">Radovi Poljoprivredno-prehrambenog fakulteta Univerziteta u Sarajevu (Works of the Faculty of Agriculture and Food Sciences, University of Sarajevo)</w:t>
+      </w:r>
+      <w:r>
+        <w:rPr>
+          <w:rFonts w:ascii="Times New Roman" w:cs="Times New Roman" w:eastAsia="Times New Roman" w:hAnsi="Times New Roman"/>
+        </w:rPr>
+        <w:t xml:space="preserve">.</w:t>
       </w:r>
     </w:p>
     <w:p>

</xml_diff>